<commit_message>
author urls; table numbering
</commit_message>
<xml_diff>
--- a/article/revision/Dollinger & Hinrichs rev-Sept-2025.docx
+++ b/article/revision/Dollinger & Hinrichs rev-Sept-2025.docx
@@ -2793,7 +2793,13 @@
     </w:tbl>
     <w:p>
       <w:r>
-        <w:t>Table 1: Absolute frequencies</w:t>
+        <w:t xml:space="preserve">Table </w:t>
+      </w:r>
+      <w:r>
+        <w:t>2</w:t>
+      </w:r>
+      <w:r>
+        <w:t>: Absolute frequencies</w:t>
       </w:r>
       <w:r>
         <w:t>: locations</w:t>
@@ -4116,95 +4122,96 @@
         <w:t>M</w:t>
       </w:r>
       <w:r>
-        <w:t xml:space="preserve">ultilinguals </w:t>
-      </w:r>
-      <w:proofErr w:type="gramStart"/>
-      <w:r>
-        <w:t xml:space="preserve">who </w:t>
-      </w:r>
-      <w:r>
-        <w:t xml:space="preserve"> were</w:t>
-      </w:r>
-      <w:proofErr w:type="gramEnd"/>
+        <w:t xml:space="preserve">ultilinguals who </w:t>
+      </w:r>
+      <w:r>
+        <w:t xml:space="preserve">were </w:t>
+      </w:r>
+      <w:r>
+        <w:t xml:space="preserve">raised in Canada are significantly more likely </w:t>
+      </w:r>
+      <w:r>
+        <w:t xml:space="preserve">than Monolinguals </w:t>
+      </w:r>
+      <w:r>
+        <w:t>to have heard about Standard CanE.</w:t>
+      </w:r>
+      <w:r>
+        <w:t xml:space="preserve"> What, however, do they understand by the term, which is used in specialist circles, but </w:t>
+      </w:r>
+      <w:r>
+        <w:t>very little in public discourse today (</w:t>
+      </w:r>
+      <w:r>
+        <w:t xml:space="preserve">Figure 3 right, </w:t>
+      </w:r>
+      <w:r>
+        <w:t xml:space="preserve">2020-24 period)? </w:t>
+      </w:r>
+    </w:p>
+    <w:p>
+      <w:pPr>
+        <w:ind w:firstLine="720"/>
+      </w:pPr>
+      <w:r>
+        <w:t>An</w:t>
+      </w:r>
+      <w:r>
+        <w:t xml:space="preserve"> open answer </w:t>
+      </w:r>
+      <w:r>
+        <w:t>field</w:t>
+      </w:r>
+      <w:r>
+        <w:t xml:space="preserve"> solicited definitions of Standard Canadian English, with the options to </w:t>
+      </w:r>
+      <w:r>
+        <w:t>decline</w:t>
+      </w:r>
+      <w:r>
+        <w:t xml:space="preserve"> (</w:t>
+      </w:r>
+      <w:r>
+        <w:t>“</w:t>
+      </w:r>
+      <w:r>
+        <w:t>don’t know what it is</w:t>
+      </w:r>
+      <w:r>
+        <w:t>”</w:t>
+      </w:r>
+      <w:r>
+        <w:t xml:space="preserve">, </w:t>
+      </w:r>
+      <w:r>
+        <w:t>“</w:t>
+      </w:r>
+      <w:r>
+        <w:t>do know it but cannot describe it well</w:t>
+      </w:r>
+      <w:r>
+        <w:t>”</w:t>
+      </w:r>
+      <w:r>
+        <w:t xml:space="preserve">), </w:t>
+      </w:r>
+      <w:r>
+        <w:t xml:space="preserve">was designed to </w:t>
+      </w:r>
+      <w:r>
+        <w:t xml:space="preserve">yield only the answers of the confident respondents in that aspect, some of which are reproduced </w:t>
+      </w:r>
+      <w:r>
+        <w:t xml:space="preserve">in </w:t>
+      </w:r>
+      <w:r>
+        <w:rPr>
+          <w:strike/>
+        </w:rPr>
+        <w:t>Table 2</w:t>
+      </w:r>
       <w:r>
         <w:t xml:space="preserve"> </w:t>
-      </w:r>
-      <w:r>
-        <w:t xml:space="preserve">raised in Canada are significantly more likely </w:t>
-      </w:r>
-      <w:r>
-        <w:t xml:space="preserve">than Monolinguals </w:t>
-      </w:r>
-      <w:r>
-        <w:t>to have heard about Standard CanE.</w:t>
-      </w:r>
-      <w:r>
-        <w:t xml:space="preserve"> What, however, do they understand by the term, which is used in specialist circles, but </w:t>
-      </w:r>
-      <w:r>
-        <w:t>very little in public discourse today (</w:t>
-      </w:r>
-      <w:r>
-        <w:t xml:space="preserve">Figure 3 right, </w:t>
-      </w:r>
-      <w:r>
-        <w:t xml:space="preserve">2020-24 period)? </w:t>
-      </w:r>
-    </w:p>
-    <w:p>
-      <w:pPr>
-        <w:ind w:firstLine="720"/>
-      </w:pPr>
-      <w:r>
-        <w:t>An</w:t>
-      </w:r>
-      <w:r>
-        <w:t xml:space="preserve"> open answer </w:t>
-      </w:r>
-      <w:r>
-        <w:t>field</w:t>
-      </w:r>
-      <w:r>
-        <w:t xml:space="preserve"> solicited definitions of Standard Canadian English, with the options to </w:t>
-      </w:r>
-      <w:r>
-        <w:t>decline</w:t>
-      </w:r>
-      <w:r>
-        <w:t xml:space="preserve"> (</w:t>
-      </w:r>
-      <w:r>
-        <w:t>“</w:t>
-      </w:r>
-      <w:r>
-        <w:t>don’t know what it is</w:t>
-      </w:r>
-      <w:r>
-        <w:t>”</w:t>
-      </w:r>
-      <w:r>
-        <w:t xml:space="preserve">, </w:t>
-      </w:r>
-      <w:r>
-        <w:t>“</w:t>
-      </w:r>
-      <w:r>
-        <w:t>do know it but cannot describe it well</w:t>
-      </w:r>
-      <w:r>
-        <w:t>”</w:t>
-      </w:r>
-      <w:r>
-        <w:t xml:space="preserve">), </w:t>
-      </w:r>
-      <w:r>
-        <w:t xml:space="preserve">was designed to </w:t>
-      </w:r>
-      <w:r>
-        <w:t xml:space="preserve">yield only the answers of the confident respondents in that aspect, some of which are reproduced </w:t>
-      </w:r>
-      <w:r>
-        <w:t xml:space="preserve">in Table 2 </w:t>
       </w:r>
       <w:r>
         <w:t>below:</w:t>
@@ -10670,6 +10677,11 @@
         <w:docPartUnique/>
       </w:docPartObj>
     </w:sdtPr>
+    <w:sdtEndPr>
+      <w:rPr>
+        <w:rStyle w:val="PageNumber"/>
+      </w:rPr>
+    </w:sdtEndPr>
     <w:sdtContent>
       <w:p>
         <w:pPr>
@@ -10727,6 +10739,11 @@
         <w:docPartUnique/>
       </w:docPartObj>
     </w:sdtPr>
+    <w:sdtEndPr>
+      <w:rPr>
+        <w:rStyle w:val="PageNumber"/>
+      </w:rPr>
+    </w:sdtEndPr>
     <w:sdtContent>
       <w:p>
         <w:pPr>

</xml_diff>

<commit_message>
up to fig 5
</commit_message>
<xml_diff>
--- a/article/revision/Dollinger & Hinrichs rev-Sept-2025.docx
+++ b/article/revision/Dollinger & Hinrichs rev-Sept-2025.docx
@@ -2879,54 +2879,6 @@
         </w:drawing>
       </w:r>
     </w:p>
-    <w:p>
-      <w:r>
-        <w:rPr>
-          <w:noProof/>
-        </w:rPr>
-        <w:drawing>
-          <wp:inline distT="0" distB="0" distL="0" distR="0" wp14:anchorId="14FC4AF7" wp14:editId="2CA4EC98">
-            <wp:extent cx="2916315" cy="1944210"/>
-            <wp:effectExtent l="0" t="0" r="5080" b="0"/>
-            <wp:docPr id="1403289332" name="Picture 2" descr="A graph of age and age&#10;&#10;AI-generated content may be incorrect."/>
-            <wp:cNvGraphicFramePr>
-              <a:graphicFrameLocks xmlns:a="http://schemas.openxmlformats.org/drawingml/2006/main" noChangeAspect="1"/>
-            </wp:cNvGraphicFramePr>
-            <a:graphic xmlns:a="http://schemas.openxmlformats.org/drawingml/2006/main">
-              <a:graphicData uri="http://schemas.openxmlformats.org/drawingml/2006/picture">
-                <pic:pic xmlns:pic="http://schemas.openxmlformats.org/drawingml/2006/picture">
-                  <pic:nvPicPr>
-                    <pic:cNvPr id="1403289332" name="Picture 2" descr="A graph of age and age&#10;&#10;AI-generated content may be incorrect."/>
-                    <pic:cNvPicPr/>
-                  </pic:nvPicPr>
-                  <pic:blipFill>
-                    <a:blip r:embed="rId12" cstate="print">
-                      <a:extLst>
-                        <a:ext uri="{28A0092B-C50C-407E-A947-70E740481C1C}">
-                          <a14:useLocalDpi xmlns:a14="http://schemas.microsoft.com/office/drawing/2010/main" val="0"/>
-                        </a:ext>
-                      </a:extLst>
-                    </a:blip>
-                    <a:stretch>
-                      <a:fillRect/>
-                    </a:stretch>
-                  </pic:blipFill>
-                  <pic:spPr>
-                    <a:xfrm>
-                      <a:off x="0" y="0"/>
-                      <a:ext cx="2932031" cy="1954688"/>
-                    </a:xfrm>
-                    <a:prstGeom prst="rect">
-                      <a:avLst/>
-                    </a:prstGeom>
-                  </pic:spPr>
-                </pic:pic>
-              </a:graphicData>
-            </a:graphic>
-          </wp:inline>
-        </w:drawing>
-      </w:r>
-    </w:p>
     <w:p/>
     <w:p>
       <w:r>
@@ -3063,7 +3015,11 @@
         <w:t>,</w:t>
       </w:r>
       <w:r>
-        <w:t xml:space="preserve"> like American or British English. On the question of spelling, the sample is more divided, with more undecided ones (26.4%) than definite yeses (24.8%). </w:t>
+        <w:t xml:space="preserve"> like American or British English. On the question of spelling, the sample is more divided, with more undecided ones (26.4%) than definite yeses </w:t>
+      </w:r>
+      <w:r>
+        <w:lastRenderedPageBreak/>
+        <w:t xml:space="preserve">(24.8%). </w:t>
       </w:r>
       <w:r>
         <w:t xml:space="preserve">This is somewhat </w:t>
@@ -3123,7 +3079,7 @@
                     <pic:cNvPicPr/>
                   </pic:nvPicPr>
                   <pic:blipFill>
-                    <a:blip r:embed="rId13"/>
+                    <a:blip r:embed="rId12"/>
                     <a:stretch>
                       <a:fillRect/>
                     </a:stretch>
@@ -3302,11 +3258,7 @@
         <w:t xml:space="preserve"> a variety, i.e.</w:t>
       </w:r>
       <w:r>
-        <w:t xml:space="preserve"> Canadian English. In the public and in </w:t>
-      </w:r>
-      <w:r>
-        <w:lastRenderedPageBreak/>
-        <w:t>schooling, however, uptake of S</w:t>
+        <w:t xml:space="preserve"> Canadian English. In the public and in schooling, however, uptake of S</w:t>
       </w:r>
       <w:r>
         <w:t>t</w:t>
@@ -3413,6 +3365,7 @@
               <w:rPr>
                 <w:noProof/>
               </w:rPr>
+              <w:lastRenderedPageBreak/>
               <w:drawing>
                 <wp:inline distT="0" distB="0" distL="0" distR="0" wp14:anchorId="2627937F" wp14:editId="57524634">
                   <wp:extent cx="2716611" cy="1279071"/>
@@ -3429,7 +3382,7 @@
                           <pic:cNvPicPr/>
                         </pic:nvPicPr>
                         <pic:blipFill>
-                          <a:blip r:embed="rId14"/>
+                          <a:blip r:embed="rId13"/>
                           <a:stretch>
                             <a:fillRect/>
                           </a:stretch>
@@ -3476,7 +3429,7 @@
                           <pic:cNvPicPr/>
                         </pic:nvPicPr>
                         <pic:blipFill>
-                          <a:blip r:embed="rId15"/>
+                          <a:blip r:embed="rId14"/>
                           <a:stretch>
                             <a:fillRect/>
                           </a:stretch>
@@ -3530,11 +3483,9 @@
       <w:r>
         <w:t xml:space="preserve">, with the uptake of Canadian dictionary titles </w:t>
       </w:r>
-      <w:proofErr w:type="gramStart"/>
       <w:r>
         <w:t>lagging behind</w:t>
       </w:r>
-      <w:proofErr w:type="gramEnd"/>
       <w:r>
         <w:t xml:space="preserve"> </w:t>
       </w:r>
@@ -3713,7 +3664,7 @@
                     <pic:cNvPicPr/>
                   </pic:nvPicPr>
                   <pic:blipFill>
-                    <a:blip r:embed="rId16"/>
+                    <a:blip r:embed="rId15"/>
                     <a:stretch>
                       <a:fillRect/>
                     </a:stretch>
@@ -4075,7 +4026,7 @@
                     <pic:cNvPicPr/>
                   </pic:nvPicPr>
                   <pic:blipFill>
-                    <a:blip r:embed="rId17"/>
+                    <a:blip r:embed="rId16"/>
                     <a:stretch>
                       <a:fillRect/>
                     </a:stretch>
@@ -5416,7 +5367,7 @@
                     <pic:cNvPicPr/>
                   </pic:nvPicPr>
                   <pic:blipFill>
-                    <a:blip r:embed="rId18"/>
+                    <a:blip r:embed="rId17"/>
                     <a:stretch>
                       <a:fillRect/>
                     </a:stretch>
@@ -5704,7 +5655,7 @@
                           <pic:cNvPicPr/>
                         </pic:nvPicPr>
                         <pic:blipFill>
-                          <a:blip r:embed="rId19"/>
+                          <a:blip r:embed="rId18"/>
                           <a:stretch>
                             <a:fillRect/>
                           </a:stretch>
@@ -5751,7 +5702,7 @@
                           <pic:cNvPicPr/>
                         </pic:nvPicPr>
                         <pic:blipFill>
-                          <a:blip r:embed="rId20"/>
+                          <a:blip r:embed="rId19"/>
                           <a:stretch>
                             <a:fillRect/>
                           </a:stretch>
@@ -6344,7 +6295,7 @@
                     <pic:cNvPicPr/>
                   </pic:nvPicPr>
                   <pic:blipFill>
-                    <a:blip r:embed="rId21"/>
+                    <a:blip r:embed="rId20"/>
                     <a:stretch>
                       <a:fillRect/>
                     </a:stretch>
@@ -6441,7 +6392,7 @@
                     <pic:cNvPicPr/>
                   </pic:nvPicPr>
                   <pic:blipFill>
-                    <a:blip r:embed="rId22"/>
+                    <a:blip r:embed="rId21"/>
                     <a:stretch>
                       <a:fillRect/>
                     </a:stretch>
@@ -6596,7 +6547,7 @@
                     <pic:cNvPicPr/>
                   </pic:nvPicPr>
                   <pic:blipFill>
-                    <a:blip r:embed="rId23"/>
+                    <a:blip r:embed="rId22"/>
                     <a:stretch>
                       <a:fillRect/>
                     </a:stretch>
@@ -6694,7 +6645,7 @@
                     <pic:cNvPicPr/>
                   </pic:nvPicPr>
                   <pic:blipFill>
-                    <a:blip r:embed="rId24"/>
+                    <a:blip r:embed="rId23"/>
                     <a:stretch>
                       <a:fillRect/>
                     </a:stretch>
@@ -6850,7 +6801,7 @@
                     <pic:cNvPicPr/>
                   </pic:nvPicPr>
                   <pic:blipFill>
-                    <a:blip r:embed="rId25"/>
+                    <a:blip r:embed="rId24"/>
                     <a:stretch>
                       <a:fillRect/>
                     </a:stretch>
@@ -7011,7 +6962,7 @@
                     <pic:cNvPicPr/>
                   </pic:nvPicPr>
                   <pic:blipFill>
-                    <a:blip r:embed="rId26"/>
+                    <a:blip r:embed="rId25"/>
                     <a:stretch>
                       <a:fillRect/>
                     </a:stretch>
@@ -7155,7 +7106,7 @@
                     <pic:cNvPicPr/>
                   </pic:nvPicPr>
                   <pic:blipFill>
-                    <a:blip r:embed="rId27"/>
+                    <a:blip r:embed="rId26"/>
                     <a:stretch>
                       <a:fillRect/>
                     </a:stretch>
@@ -7400,7 +7351,7 @@
                           <pic:cNvPicPr/>
                         </pic:nvPicPr>
                         <pic:blipFill>
-                          <a:blip r:embed="rId28"/>
+                          <a:blip r:embed="rId27"/>
                           <a:stretch>
                             <a:fillRect/>
                           </a:stretch>
@@ -7447,7 +7398,7 @@
                           <pic:cNvPicPr/>
                         </pic:nvPicPr>
                         <pic:blipFill>
-                          <a:blip r:embed="rId29"/>
+                          <a:blip r:embed="rId28"/>
                           <a:stretch>
                             <a:fillRect/>
                           </a:stretch>
@@ -7944,7 +7895,7 @@
       <w:r>
         <w:t>. This has shifted in the early 2000s and is still ongoing. However, today there is, in comparison to the early 2000s, little to no public discourse about the linguistic identity of Anglophone Canadians, as shown in Figure 1. It will remain to be see if and to what degree linguistic work on the unique angle of Canadian English (</w:t>
       </w:r>
-      <w:hyperlink r:id="rId30" w:history="1">
+      <w:hyperlink r:id="rId29" w:history="1">
         <w:r>
           <w:rPr>
             <w:rStyle w:val="Hyperlink"/>
@@ -8523,7 +8474,7 @@
         </w:rPr>
         <w:t> Vancouver, BC: University of British Columbia, </w:t>
       </w:r>
-      <w:hyperlink r:id="rId31" w:history="1">
+      <w:hyperlink r:id="rId30" w:history="1">
         <w:r>
           <w:rPr>
             <w:rStyle w:val="Hyperlink"/>
@@ -8544,7 +8495,7 @@
         </w:rPr>
         <w:t>. DOI: </w:t>
       </w:r>
-      <w:hyperlink r:id="rId32" w:history="1">
+      <w:hyperlink r:id="rId31" w:history="1">
         <w:r>
           <w:rPr>
             <w:rStyle w:val="Hyperlink"/>
@@ -8715,7 +8666,7 @@
         </w:rPr>
         <w:t xml:space="preserve">. </w:t>
       </w:r>
-      <w:hyperlink r:id="rId33" w:history="1">
+      <w:hyperlink r:id="rId32" w:history="1">
         <w:r>
           <w:rPr>
             <w:rStyle w:val="Hyperlink"/>
@@ -9876,7 +9827,7 @@
         </w:rPr>
         <w:t xml:space="preserve">. Graz: PCL-Press, </w:t>
       </w:r>
-      <w:hyperlink r:id="rId34" w:history="1">
+      <w:hyperlink r:id="rId33" w:history="1">
         <w:r>
           <w:rPr>
             <w:rStyle w:val="Hyperlink"/>
@@ -10594,8 +10545,8 @@
     </w:p>
     <w:p/>
     <w:sectPr>
-      <w:footerReference w:type="even" r:id="rId35"/>
-      <w:footerReference w:type="default" r:id="rId36"/>
+      <w:footerReference w:type="even" r:id="rId34"/>
+      <w:footerReference w:type="default" r:id="rId35"/>
       <w:pgSz w:w="12240" w:h="15840"/>
       <w:pgMar w:top="1440" w:right="1440" w:bottom="1440" w:left="1440" w:header="709" w:footer="709" w:gutter="0"/>
       <w:cols w:space="708"/>

</xml_diff>

<commit_message>
up to fig 9/10
</commit_message>
<xml_diff>
--- a/article/revision/Dollinger & Hinrichs rev-Sept-2025.docx
+++ b/article/revision/Dollinger & Hinrichs rev-Sept-2025.docx
@@ -5793,23 +5793,20 @@
       <w:r>
         <w:t xml:space="preserve"> seems to </w:t>
       </w:r>
+      <w:r>
+        <w:t>be predominantly</w:t>
+      </w:r>
+      <w:r>
+        <w:t xml:space="preserve"> </w:t>
+      </w:r>
       <w:proofErr w:type="gramStart"/>
       <w:r>
-        <w:t xml:space="preserve">be  </w:t>
-      </w:r>
-      <w:r>
-        <w:t>predominantly</w:t>
+        <w:t>female-</w:t>
+      </w:r>
+      <w:r>
+        <w:t>led</w:t>
       </w:r>
       <w:proofErr w:type="gramEnd"/>
-      <w:r>
-        <w:t xml:space="preserve"> </w:t>
-      </w:r>
-      <w:r>
-        <w:t>female-</w:t>
-      </w:r>
-      <w:r>
-        <w:t>led</w:t>
-      </w:r>
       <w:r>
         <w:t xml:space="preserve">. In terms of age, we see a slight decrease among the younger </w:t>
       </w:r>
@@ -10628,11 +10625,6 @@
         <w:docPartUnique/>
       </w:docPartObj>
     </w:sdtPr>
-    <w:sdtEndPr>
-      <w:rPr>
-        <w:rStyle w:val="PageNumber"/>
-      </w:rPr>
-    </w:sdtEndPr>
     <w:sdtContent>
       <w:p>
         <w:pPr>
@@ -10690,11 +10682,6 @@
         <w:docPartUnique/>
       </w:docPartObj>
     </w:sdtPr>
-    <w:sdtEndPr>
-      <w:rPr>
-        <w:rStyle w:val="PageNumber"/>
-      </w:rPr>
-    </w:sdtEndPr>
     <w:sdtContent>
       <w:p>
         <w:pPr>

</xml_diff>

<commit_message>
Fig 14 <-> 15 confusion
</commit_message>
<xml_diff>
--- a/article/revision/Dollinger & Hinrichs rev-Sept-2025.docx
+++ b/article/revision/Dollinger & Hinrichs rev-Sept-2025.docx
@@ -7421,7 +7421,13 @@
     </w:tbl>
     <w:p>
       <w:r>
-        <w:t>Figure 15: “unspecified” “standard English” (left) and the pluricentric standards with three standards (right)</w:t>
+        <w:t>Figure 1</w:t>
+      </w:r>
+      <w:r>
+        <w:t>4</w:t>
+      </w:r>
+      <w:r>
+        <w:t>: “unspecified” “standard English” (left) and the pluricentric standards with three standards (right)</w:t>
       </w:r>
     </w:p>
     <w:p/>
@@ -10659,7 +10665,7 @@
     <w:pPr>
       <w:pStyle w:val="Footer"/>
       <w:ind w:right="360"/>
-      <w:pPrChange w:id="2" w:author="Hinrichs, Lars [2]" w:date="2025-05-02T22:36:00Z">
+      <w:pPrChange w:id="3" w:author="Hinrichs, Lars [2]" w:date="2025-05-02T22:36:00Z">
         <w:pPr>
           <w:pStyle w:val="Footer"/>
         </w:pPr>

</xml_diff>